<commit_message>
Condense resume_project.docx to tight one-liner bullets per section
Co-authored-by: MengQxuan <132590327+MengQxuan@users.noreply.github.com>
</commit_message>
<xml_diff>
--- a/resume_project.docx
+++ b/resume_project.docx
@@ -5,38 +5,38 @@
     <w:p>
       <w:pPr>
         <w:jc w:val="center"/>
-        <w:spacing w:before="0" w:after="120"/>
+        <w:spacing w:before="0" w:after="80"/>
       </w:pPr>
       <w:r>
         <w:rPr>
           <w:rFonts w:ascii="宋体" w:hAnsi="宋体" w:eastAsia="宋体"/>
           <w:b/>
+          <w:i w:val="0"/>
           <w:color w:val="1F497D"/>
-          <w:sz w:val="32"/>
+          <w:sz w:val="28"/>
         </w:rPr>
-        <w:t>基于 GroundingDINO 的开放词汇目标检测</w:t>
-        <w:br/>
-        <w:t>模型结构压缩与推理加速研究</w:t>
+        <w:t>基于 GroundingDINO 的开放词汇目标检测模型结构压缩与推理加速研究</w:t>
       </w:r>
     </w:p>
     <w:p>
       <w:pPr>
         <w:jc w:val="center"/>
-        <w:spacing w:before="0" w:after="240"/>
+        <w:spacing w:before="0" w:after="160"/>
       </w:pPr>
       <w:r>
         <w:rPr>
           <w:rFonts w:ascii="宋体" w:hAnsi="宋体" w:eastAsia="宋体"/>
           <w:b w:val="0"/>
+          <w:i w:val="0"/>
           <w:color w:val="595959"/>
-          <w:sz w:val="21"/>
+          <w:sz w:val="20"/>
         </w:rPr>
         <w:t>2026.01 – 至今</w:t>
       </w:r>
     </w:p>
     <w:p>
       <w:pPr>
-        <w:spacing w:before="60" w:after="60"/>
+        <w:spacing w:before="40" w:after="40"/>
         <w:pBdr>
           <w:bottom w:val="single" w:sz="6" w:space="1" w:color="4472C4"/>
         </w:pBdr>
@@ -44,136 +44,35 @@
     </w:p>
     <w:p>
       <w:pPr>
-        <w:spacing w:before="240" w:after="80"/>
+        <w:spacing w:before="180" w:after="60"/>
       </w:pPr>
       <w:r>
         <w:rPr>
           <w:rFonts w:ascii="黑体" w:hAnsi="黑体" w:eastAsia="黑体"/>
           <w:b/>
           <w:color w:val="1F497D"/>
-          <w:sz w:val="24"/>
-          <w:u w:val="single"/>
+          <w:sz w:val="22"/>
         </w:rPr>
-        <w:t>一、项目背景</w:t>
+        <w:t>项目背景</w:t>
       </w:r>
     </w:p>
     <w:p>
       <w:pPr>
-        <w:spacing w:before="60" w:after="60" w:line="360" w:lineRule="auto"/>
-        <w:ind w:left="0"/>
+        <w:spacing w:before="40" w:after="80"/>
       </w:pPr>
       <w:r>
         <w:rPr>
           <w:rFonts w:ascii="宋体" w:hAnsi="宋体" w:eastAsia="宋体"/>
+          <w:b w:val="0"/>
+          <w:i w:val="0"/>
           <w:sz w:val="21"/>
         </w:rPr>
-        <w:t>GroundingDINO 是近年来开放词汇目标检测（Open-Vocabulary Object Detection）领域的代表性工作，通过将视觉 Transformer 与预训练语言模型（BERT）深度融合，实现了以任意自然语言描述为输入的目标定位能力，在零样本与少样本检测场景下取得了业界领先水平。然而，该模型的推理计算开销较大，在实际产品部署中存在以下核心挑战：</w:t>
+        <w:t>GroundingDINO 将视觉 Transformer 与 BERT 深度融合，实现任意自然语言驱动的目标检测，但其推理开销大、Object Queries 冗余严重、跨模态融合模块（BiAttentionBlock）延迟随 Caption 长度呈二次方增长。本项目以 Open-GroundingDINO 为基础，在精度损失 ≤5% 的目标下，系统开展结构剪枝与推理加速研究，将显存从 ~12 GB 降至 10 GB 以内。</w:t>
       </w:r>
     </w:p>
     <w:p>
       <w:pPr>
-        <w:pStyle w:val="ListBullet"/>
         <w:spacing w:before="40" w:after="40"/>
-        <w:ind w:left="283" w:hanging="227"/>
-      </w:pPr>
-      <w:r>
-        <w:rPr>
-          <w:rFonts w:ascii="宋体" w:hAnsi="宋体" w:eastAsia="宋体"/>
-          <w:b/>
-          <w:sz w:val="21"/>
-        </w:rPr>
-        <w:t xml:space="preserve">■ </w:t>
-      </w:r>
-      <w:r>
-        <w:rPr>
-          <w:rFonts w:ascii="宋体" w:hAnsi="宋体" w:eastAsia="宋体"/>
-          <w:sz w:val="21"/>
-        </w:rPr>
-        <w:t>Object Queries 默认配置（900个）存在严重冗余，占用大量显存与计算资源；</w:t>
-      </w:r>
-    </w:p>
-    <w:p>
-      <w:pPr>
-        <w:pStyle w:val="ListBullet"/>
-        <w:spacing w:before="40" w:after="40"/>
-        <w:ind w:left="283" w:hanging="227"/>
-      </w:pPr>
-      <w:r>
-        <w:rPr>
-          <w:rFonts w:ascii="宋体" w:hAnsi="宋体" w:eastAsia="宋体"/>
-          <w:b/>
-          <w:sz w:val="21"/>
-        </w:rPr>
-        <w:t xml:space="preserve">■ </w:t>
-      </w:r>
-      <w:r>
-        <w:rPr>
-          <w:rFonts w:ascii="宋体" w:hAnsi="宋体" w:eastAsia="宋体"/>
-          <w:sz w:val="21"/>
-        </w:rPr>
-        <w:t>文本-视觉跨模态融合模块（BiAttentionBlock）随 Caption 长度呈二次方增长，是推理延迟的主要瓶颈；</w:t>
-      </w:r>
-    </w:p>
-    <w:p>
-      <w:pPr>
-        <w:pStyle w:val="ListBullet"/>
-        <w:spacing w:before="40" w:after="40"/>
-        <w:ind w:left="283" w:hanging="227"/>
-      </w:pPr>
-      <w:r>
-        <w:rPr>
-          <w:rFonts w:ascii="宋体" w:hAnsi="宋体" w:eastAsia="宋体"/>
-          <w:b/>
-          <w:sz w:val="21"/>
-        </w:rPr>
-        <w:t xml:space="preserve">■ </w:t>
-      </w:r>
-      <w:r>
-        <w:rPr>
-          <w:rFonts w:ascii="宋体" w:hAnsi="宋体" w:eastAsia="宋体"/>
-          <w:sz w:val="21"/>
-        </w:rPr>
-        <w:t>BERT-base 文本编码器参数量大，在端侧或资源受限场景下难以部署；</w:t>
-      </w:r>
-    </w:p>
-    <w:p>
-      <w:pPr>
-        <w:pStyle w:val="ListBullet"/>
-        <w:spacing w:before="40" w:after="40"/>
-        <w:ind w:left="283" w:hanging="227"/>
-      </w:pPr>
-      <w:r>
-        <w:rPr>
-          <w:rFonts w:ascii="宋体" w:hAnsi="宋体" w:eastAsia="宋体"/>
-          <w:b/>
-          <w:sz w:val="21"/>
-        </w:rPr>
-        <w:t xml:space="preserve">■ </w:t>
-      </w:r>
-      <w:r>
-        <w:rPr>
-          <w:rFonts w:ascii="宋体" w:hAnsi="宋体" w:eastAsia="宋体"/>
-          <w:sz w:val="21"/>
-        </w:rPr>
-        <w:t>原始模型缺乏系统性的结构剪枝与量化友好性验证，无法直接应用于工业级推理加速流程。</w:t>
-      </w:r>
-    </w:p>
-    <w:p>
-      <w:pPr>
-        <w:spacing w:before="60" w:after="60" w:line="360" w:lineRule="auto"/>
-        <w:ind w:left="0"/>
-      </w:pPr>
-      <w:r>
-        <w:rPr>
-          <w:rFonts w:ascii="宋体" w:hAnsi="宋体" w:eastAsia="宋体"/>
-          <w:sz w:val="21"/>
-        </w:rPr>
-        <w:t>本项目以 Open-GroundingDINO 开源实现为基础，系统性地开展了模型结构冗余分析、轻量化设计与推理加速实验，目标是在精度损失可控（≤5%）的前提下，将模型训练显存从 ~12 GB 降低至 10 GB 以内，并为后续量化部署奠定坚实基础。</w:t>
-      </w:r>
-    </w:p>
-    <w:p>
-      <w:pPr>
-        <w:spacing w:before="60" w:after="60"/>
         <w:pBdr>
           <w:bottom w:val="single" w:sz="6" w:space="1" w:color="4472C4"/>
         </w:pBdr>
@@ -181,338 +80,121 @@
     </w:p>
     <w:p>
       <w:pPr>
-        <w:spacing w:before="240" w:after="80"/>
+        <w:spacing w:before="180" w:after="60"/>
       </w:pPr>
       <w:r>
         <w:rPr>
           <w:rFonts w:ascii="黑体" w:hAnsi="黑体" w:eastAsia="黑体"/>
           <w:b/>
           <w:color w:val="1F497D"/>
-          <w:sz w:val="24"/>
-          <w:u w:val="single"/>
+          <w:sz w:val="22"/>
         </w:rPr>
-        <w:t>二、主要工作内容</w:t>
+        <w:t>主要工作</w:t>
       </w:r>
     </w:p>
     <w:p>
       <w:pPr>
-        <w:spacing w:before="60" w:after="60" w:line="360" w:lineRule="auto"/>
-        <w:ind w:left="0"/>
-      </w:pPr>
-      <w:r>
-        <w:rPr>
-          <w:rFonts w:ascii="宋体" w:hAnsi="宋体" w:eastAsia="宋体"/>
-          <w:sz w:val="21"/>
-        </w:rPr>
-        <w:t>（1）完整复现 GroundingDINO 训练与评估流程</w:t>
-      </w:r>
-    </w:p>
-    <w:p>
-      <w:pPr>
-        <w:pStyle w:val="ListBullet"/>
-        <w:spacing w:before="40" w:after="40"/>
-        <w:ind w:left="283" w:hanging="227"/>
+        <w:spacing w:before="50" w:after="50"/>
+        <w:ind w:left="227"/>
       </w:pPr>
       <w:r>
         <w:rPr>
           <w:rFonts w:ascii="宋体" w:hAnsi="宋体" w:eastAsia="宋体"/>
           <w:b/>
+          <w:i w:val="0"/>
+          <w:color w:val="1F497D"/>
           <w:sz w:val="21"/>
         </w:rPr>
-        <w:t xml:space="preserve">• </w:t>
+        <w:t>▸ 复现与基准建立：</w:t>
       </w:r>
       <w:r>
         <w:rPr>
           <w:rFonts w:ascii="宋体" w:hAnsi="宋体" w:eastAsia="宋体"/>
+          <w:b w:val="0"/>
+          <w:i w:val="0"/>
           <w:sz w:val="21"/>
         </w:rPr>
-        <w:t>基于 Open-GroundingDINO 完成环境搭建（RTX 4090 × 2，CUDA 11.8，PyTorch 2.1，DDP 分布式训练）；</w:t>
+        <w:t>完成 COCO 2017 ODVG 格式转换与 DDP 分布式训练全流程，建立 Baseline（AP=0.552），种子固定后波动 ≤0.002。</w:t>
       </w:r>
     </w:p>
     <w:p>
       <w:pPr>
-        <w:pStyle w:val="ListBullet"/>
-        <w:spacing w:before="40" w:after="40"/>
-        <w:ind w:left="283" w:hanging="227"/>
+        <w:spacing w:before="50" w:after="50"/>
+        <w:ind w:left="227"/>
       </w:pPr>
       <w:r>
         <w:rPr>
           <w:rFonts w:ascii="宋体" w:hAnsi="宋体" w:eastAsia="宋体"/>
           <w:b/>
+          <w:i w:val="0"/>
+          <w:color w:val="1F497D"/>
           <w:sz w:val="21"/>
         </w:rPr>
-        <w:t xml:space="preserve">• </w:t>
+        <w:t>▸ Queries 冗余分析：</w:t>
       </w:r>
       <w:r>
         <w:rPr>
           <w:rFonts w:ascii="宋体" w:hAnsi="宋体" w:eastAsia="宋体"/>
+          <w:b w:val="0"/>
+          <w:i w:val="0"/>
           <w:sz w:val="21"/>
         </w:rPr>
-        <w:t>实现 COCO 2017 → ODVG 格式转换 pipeline，训练集 10k / 验证集 1k，建立稳定 Baseline（AP = 0.552）；</w:t>
+        <w:t>num_queries 900→200 精度几乎不变（ΔAP&lt;0.003）；Top-K Pruning 无效；Profiling 定位真正瓶颈为 enc_fusion（BiAttentionBlock，占 Encoder 增量 ~98%）。</w:t>
       </w:r>
     </w:p>
     <w:p>
       <w:pPr>
-        <w:pStyle w:val="ListBullet"/>
-        <w:spacing w:before="40" w:after="40"/>
-        <w:ind w:left="283" w:hanging="227"/>
+        <w:spacing w:before="50" w:after="50"/>
+        <w:ind w:left="227"/>
       </w:pPr>
       <w:r>
         <w:rPr>
           <w:rFonts w:ascii="宋体" w:hAnsi="宋体" w:eastAsia="宋体"/>
           <w:b/>
+          <w:i w:val="0"/>
+          <w:color w:val="1F497D"/>
           <w:sz w:val="21"/>
         </w:rPr>
-        <w:t xml:space="preserve">• </w:t>
+        <w:t>▸ 多阶段轻量化：</w:t>
       </w:r>
       <w:r>
         <w:rPr>
           <w:rFonts w:ascii="宋体" w:hAnsi="宋体" w:eastAsia="宋体"/>
+          <w:b w:val="0"/>
+          <w:i w:val="0"/>
           <w:sz w:val="21"/>
         </w:rPr>
-        <w:t>验证固定随机种子后结果波动 ≤ 0.002，为后续消融实验提供可靠对照基准。</w:t>
+        <w:t>Stage1 层剪枝（Enc 6→4, Dec 6→3）；Stage2 降采样（dec_n_points 4→2）；Stage3 AMP 数值稳定化（offset clamp + FP32 softmax）；Stage4 BERT→DistilBERT 替换。</w:t>
       </w:r>
     </w:p>
     <w:p>
       <w:pPr>
-        <w:spacing w:before="60" w:after="60" w:line="360" w:lineRule="auto"/>
-        <w:ind w:left="0"/>
-      </w:pPr>
-      <w:r>
-        <w:rPr>
-          <w:rFonts w:ascii="宋体" w:hAnsi="宋体" w:eastAsia="宋体"/>
-          <w:sz w:val="21"/>
-        </w:rPr>
-        <w:t>（2）Object Queries 冗余性系统消融实验</w:t>
-      </w:r>
-    </w:p>
-    <w:p>
-      <w:pPr>
-        <w:pStyle w:val="ListBullet"/>
-        <w:spacing w:before="40" w:after="40"/>
-        <w:ind w:left="283" w:hanging="227"/>
+        <w:spacing w:before="50" w:after="50"/>
+        <w:ind w:left="227"/>
       </w:pPr>
       <w:r>
         <w:rPr>
           <w:rFonts w:ascii="宋体" w:hAnsi="宋体" w:eastAsia="宋体"/>
           <w:b/>
+          <w:i w:val="0"/>
+          <w:color w:val="1F497D"/>
           <w:sz w:val="21"/>
         </w:rPr>
-        <w:t xml:space="preserve">• </w:t>
+        <w:t>▸ 延迟量化分析：</w:t>
       </w:r>
       <w:r>
         <w:rPr>
           <w:rFonts w:ascii="宋体" w:hAnsi="宋体" w:eastAsia="宋体"/>
+          <w:b w:val="0"/>
+          <w:i w:val="0"/>
           <w:sz w:val="21"/>
         </w:rPr>
-        <w:t>对 num_queries ∈ {900, 600, 300, 200, 50} 进行完整消融，发现 900 → 200 精度基本不变（AP 波动 &lt; 0.003），确认 DETR-style 结构的 Query 冗余问题；</w:t>
+        <w:t>Caption 长度对文本编码器延迟无影响（~4ms 恒定）；&gt;97% 增量来自 enc_fusion 中的 softmax/context bmm，建立二次方增长模型，为 Token Pruning / Flash Attention 指明优化路径。</w:t>
       </w:r>
     </w:p>
     <w:p>
       <w:pPr>
-        <w:pStyle w:val="ListBullet"/>
         <w:spacing w:before="40" w:after="40"/>
-        <w:ind w:left="283" w:hanging="227"/>
-      </w:pPr>
-      <w:r>
-        <w:rPr>
-          <w:rFonts w:ascii="宋体" w:hAnsi="宋体" w:eastAsia="宋体"/>
-          <w:b/>
-          <w:sz w:val="21"/>
-        </w:rPr>
-        <w:t xml:space="preserve">• </w:t>
-      </w:r>
-      <w:r>
-        <w:rPr>
-          <w:rFonts w:ascii="宋体" w:hAnsi="宋体" w:eastAsia="宋体"/>
-          <w:sz w:val="21"/>
-        </w:rPr>
-        <w:t>验证简单 Top-K Query Pruning 无效：Hungarian Matching 阶段仍依赖全量 Queries，推理瓶颈不在 Query 数量本身；</w:t>
-      </w:r>
-    </w:p>
-    <w:p>
-      <w:pPr>
-        <w:pStyle w:val="ListBullet"/>
-        <w:spacing w:before="40" w:after="40"/>
-        <w:ind w:left="283" w:hanging="227"/>
-      </w:pPr>
-      <w:r>
-        <w:rPr>
-          <w:rFonts w:ascii="宋体" w:hAnsi="宋体" w:eastAsia="宋体"/>
-          <w:b/>
-          <w:sz w:val="21"/>
-        </w:rPr>
-        <w:t xml:space="preserve">• </w:t>
-      </w:r>
-      <w:r>
-        <w:rPr>
-          <w:rFonts w:ascii="宋体" w:hAnsi="宋体" w:eastAsia="宋体"/>
-          <w:sz w:val="21"/>
-        </w:rPr>
-        <w:t>通过精细化 Profiling 定位真正瓶颈：推理延迟主要来自 Backbone（~43ms）与 enc_fusion（BiAttentionBlock，40–87ms）。</w:t>
-      </w:r>
-    </w:p>
-    <w:p>
-      <w:pPr>
-        <w:spacing w:before="60" w:after="60" w:line="360" w:lineRule="auto"/>
-        <w:ind w:left="0"/>
-      </w:pPr>
-      <w:r>
-        <w:rPr>
-          <w:rFonts w:ascii="宋体" w:hAnsi="宋体" w:eastAsia="宋体"/>
-          <w:sz w:val="21"/>
-        </w:rPr>
-        <w:t>（3）多阶段结构轻量化优化</w:t>
-      </w:r>
-    </w:p>
-    <w:p>
-      <w:pPr>
-        <w:pStyle w:val="ListBullet"/>
-        <w:spacing w:before="40" w:after="40"/>
-        <w:ind w:left="283" w:hanging="227"/>
-      </w:pPr>
-      <w:r>
-        <w:rPr>
-          <w:rFonts w:ascii="宋体" w:hAnsi="宋体" w:eastAsia="宋体"/>
-          <w:b/>
-          <w:sz w:val="21"/>
-        </w:rPr>
-        <w:t xml:space="preserve">• </w:t>
-      </w:r>
-      <w:r>
-        <w:rPr>
-          <w:rFonts w:ascii="宋体" w:hAnsi="宋体" w:eastAsia="宋体"/>
-          <w:sz w:val="21"/>
-        </w:rPr>
-        <w:t>Stage 1 – Transformer 层剪枝（Encoder 6→4 层，Decoder 6→3 层）：训练耗时减少约 26%，显存节省 ~1.4 GB，精度损失约 2.3%；</w:t>
-      </w:r>
-    </w:p>
-    <w:p>
-      <w:pPr>
-        <w:pStyle w:val="ListBullet"/>
-        <w:spacing w:before="40" w:after="40"/>
-        <w:ind w:left="283" w:hanging="227"/>
-      </w:pPr>
-      <w:r>
-        <w:rPr>
-          <w:rFonts w:ascii="宋体" w:hAnsi="宋体" w:eastAsia="宋体"/>
-          <w:b/>
-          <w:sz w:val="21"/>
-        </w:rPr>
-        <w:t xml:space="preserve">• </w:t>
-      </w:r>
-      <w:r>
-        <w:rPr>
-          <w:rFonts w:ascii="宋体" w:hAnsi="宋体" w:eastAsia="宋体"/>
-          <w:sz w:val="21"/>
-        </w:rPr>
-        <w:t>Stage 2 – Cross-Attention 降采样（dec_n_points：4→2）：进一步减少 Attention 计算量，精度无损；</w:t>
-      </w:r>
-    </w:p>
-    <w:p>
-      <w:pPr>
-        <w:pStyle w:val="ListBullet"/>
-        <w:spacing w:before="40" w:after="40"/>
-        <w:ind w:left="283" w:hanging="227"/>
-      </w:pPr>
-      <w:r>
-        <w:rPr>
-          <w:rFonts w:ascii="宋体" w:hAnsi="宋体" w:eastAsia="宋体"/>
-          <w:b/>
-          <w:sz w:val="21"/>
-        </w:rPr>
-        <w:t xml:space="preserve">• </w:t>
-      </w:r>
-      <w:r>
-        <w:rPr>
-          <w:rFonts w:ascii="宋体" w:hAnsi="宋体" w:eastAsia="宋体"/>
-          <w:sz w:val="21"/>
-        </w:rPr>
-        <w:t>Stage 3 – 数值稳定化（Sampling Offset Clamp + Softmax/BBox Head FP32 保持）：消除混合精度训练中的数值抖动，增强量化鲁棒性；</w:t>
-      </w:r>
-    </w:p>
-    <w:p>
-      <w:pPr>
-        <w:pStyle w:val="ListBullet"/>
-        <w:spacing w:before="40" w:after="40"/>
-        <w:ind w:left="283" w:hanging="227"/>
-      </w:pPr>
-      <w:r>
-        <w:rPr>
-          <w:rFonts w:ascii="宋体" w:hAnsi="宋体" w:eastAsia="宋体"/>
-          <w:b/>
-          <w:sz w:val="21"/>
-        </w:rPr>
-        <w:t xml:space="preserve">• </w:t>
-      </w:r>
-      <w:r>
-        <w:rPr>
-          <w:rFonts w:ascii="宋体" w:hAnsi="宋体" w:eastAsia="宋体"/>
-          <w:sz w:val="21"/>
-        </w:rPr>
-        <w:t>Stage 4 – 文本编码器替换（BERT-base → DistilBERT）：解决 3D attention mask 不兼容、token_type_ids 冲突等工程问题，通过 TextEncoderShell 统一封装，显存再降低 ~1 GB。</w:t>
-      </w:r>
-    </w:p>
-    <w:p>
-      <w:pPr>
-        <w:spacing w:before="60" w:after="60" w:line="360" w:lineRule="auto"/>
-        <w:ind w:left="0"/>
-      </w:pPr>
-      <w:r>
-        <w:rPr>
-          <w:rFonts w:ascii="宋体" w:hAnsi="宋体" w:eastAsia="宋体"/>
-          <w:sz w:val="21"/>
-        </w:rPr>
-        <w:t>（4）Caption 长度与推理性能量化分析</w:t>
-      </w:r>
-    </w:p>
-    <w:p>
-      <w:pPr>
-        <w:pStyle w:val="ListBullet"/>
-        <w:spacing w:before="40" w:after="40"/>
-        <w:ind w:left="283" w:hanging="227"/>
-      </w:pPr>
-      <w:r>
-        <w:rPr>
-          <w:rFonts w:ascii="宋体" w:hAnsi="宋体" w:eastAsia="宋体"/>
-          <w:b/>
-          <w:sz w:val="21"/>
-        </w:rPr>
-        <w:t xml:space="preserve">• </w:t>
-      </w:r>
-      <w:r>
-        <w:rPr>
-          <w:rFonts w:ascii="宋体" w:hAnsi="宋体" w:eastAsia="宋体"/>
-          <w:sz w:val="21"/>
-        </w:rPr>
-        <w:t>通过模块级 Profiling（tokenize / text_enc / backbone / enc_fusion / enc_msdef / dec）发现：文本编码器（~4ms）不随 caption 长度变化，超过 97% 的延迟增量来自 enc_fusion 中的 softmax 与 context bmm 操作；</w:t>
-      </w:r>
-    </w:p>
-    <w:p>
-      <w:pPr>
-        <w:pStyle w:val="ListBullet"/>
-        <w:spacing w:before="40" w:after="40"/>
-        <w:ind w:left="283" w:hanging="227"/>
-      </w:pPr>
-      <w:r>
-        <w:rPr>
-          <w:rFonts w:ascii="宋体" w:hAnsi="宋体" w:eastAsia="宋体"/>
-          <w:b/>
-          <w:sz w:val="21"/>
-        </w:rPr>
-        <w:t xml:space="preserve">• </w:t>
-      </w:r>
-      <w:r>
-        <w:rPr>
-          <w:rFonts w:ascii="宋体" w:hAnsi="宋体" w:eastAsia="宋体"/>
-          <w:sz w:val="21"/>
-        </w:rPr>
-        <w:t>定量建立 caption_len 与 enc_fusion 延迟的二次方增长关系，为 Token Pruning / Flash Attention 等后续优化方向提供理论依据。</w:t>
-      </w:r>
-    </w:p>
-    <w:p>
-      <w:pPr>
-        <w:spacing w:before="60" w:after="60"/>
         <w:pBdr>
           <w:bottom w:val="single" w:sz="6" w:space="1" w:color="4472C4"/>
         </w:pBdr>
@@ -520,17 +202,87 @@
     </w:p>
     <w:p>
       <w:pPr>
-        <w:spacing w:before="240" w:after="80"/>
+        <w:spacing w:before="180" w:after="60"/>
       </w:pPr>
       <w:r>
         <w:rPr>
           <w:rFonts w:ascii="黑体" w:hAnsi="黑体" w:eastAsia="黑体"/>
           <w:b/>
           <w:color w:val="1F497D"/>
-          <w:sz w:val="24"/>
-          <w:u w:val="single"/>
+          <w:sz w:val="22"/>
         </w:rPr>
-        <w:t>三、性能提升</w:t>
+        <w:t>性能提升</w:t>
+      </w:r>
+    </w:p>
+    <w:p>
+      <w:pPr>
+        <w:spacing w:before="40" w:after="80"/>
+      </w:pPr>
+      <w:r>
+        <w:rPr>
+          <w:rFonts w:ascii="宋体" w:hAnsi="宋体" w:eastAsia="宋体"/>
+          <w:b w:val="0"/>
+          <w:i w:val="0"/>
+          <w:sz w:val="21"/>
+        </w:rPr>
+        <w:t xml:space="preserve">Stage 4 最终配置（层剪枝 + 降采样 + 稳定化 + DistilBERT）较 Baseline：训练提速 </w:t>
+      </w:r>
+      <w:r>
+        <w:rPr>
+          <w:rFonts w:ascii="宋体" w:hAnsi="宋体" w:eastAsia="宋体"/>
+          <w:b/>
+          <w:i w:val="0"/>
+          <w:color w:val="1F497D"/>
+          <w:sz w:val="21"/>
+        </w:rPr>
+        <w:t>约 31%</w:t>
+      </w:r>
+      <w:r>
+        <w:rPr>
+          <w:rFonts w:ascii="宋体" w:hAnsi="宋体" w:eastAsia="宋体"/>
+          <w:b w:val="0"/>
+          <w:i w:val="0"/>
+          <w:sz w:val="21"/>
+        </w:rPr>
+        <w:t xml:space="preserve">，显存降低 </w:t>
+      </w:r>
+      <w:r>
+        <w:rPr>
+          <w:rFonts w:ascii="宋体" w:hAnsi="宋体" w:eastAsia="宋体"/>
+          <w:b/>
+          <w:i w:val="0"/>
+          <w:color w:val="1F497D"/>
+          <w:sz w:val="21"/>
+        </w:rPr>
+        <w:t>约 20%</w:t>
+      </w:r>
+      <w:r>
+        <w:rPr>
+          <w:rFonts w:ascii="宋体" w:hAnsi="宋体" w:eastAsia="宋体"/>
+          <w:b w:val="0"/>
+          <w:i w:val="0"/>
+          <w:sz w:val="21"/>
+        </w:rPr>
+        <w:t xml:space="preserve">（12.2 GB → 9.8 GB），AP 精度损失 </w:t>
+      </w:r>
+      <w:r>
+        <w:rPr>
+          <w:rFonts w:ascii="宋体" w:hAnsi="宋体" w:eastAsia="宋体"/>
+          <w:b/>
+          <w:i w:val="0"/>
+          <w:color w:val="1F497D"/>
+          <w:sz w:val="21"/>
+        </w:rPr>
+        <w:t>&lt;4%</w:t>
+      </w:r>
+      <w:r>
+        <w:rPr>
+          <w:rFonts w:ascii="宋体" w:hAnsi="宋体" w:eastAsia="宋体"/>
+          <w:b w:val="0"/>
+          <w:i w:val="0"/>
+          <w:sz w:val="21"/>
+        </w:rPr>
+        <w:t>（0.552 → 0.512）。</w:t>
       </w:r>
     </w:p>
     <w:tbl>
@@ -540,16 +292,15 @@
         <w:tblLook w:firstColumn="1" w:firstRow="1" w:lastColumn="0" w:lastRow="0" w:noHBand="0" w:noVBand="1" w:val="04A0"/>
       </w:tblPr>
       <w:tblGrid>
-        <w:gridCol w:w="1881"/>
-        <w:gridCol w:w="1881"/>
-        <w:gridCol w:w="1881"/>
-        <w:gridCol w:w="1881"/>
-        <w:gridCol w:w="1881"/>
+        <w:gridCol w:w="2436"/>
+        <w:gridCol w:w="2436"/>
+        <w:gridCol w:w="2436"/>
+        <w:gridCol w:w="2436"/>
       </w:tblGrid>
       <w:tr>
         <w:tc>
           <w:tcPr>
-            <w:tcW w:type="dxa" w:w="1881"/>
+            <w:tcW w:type="dxa" w:w="2436"/>
           </w:tcPr>
           <w:p>
             <w:pPr>
@@ -561,13 +312,13 @@
                 <w:b/>
                 <w:sz w:val="18"/>
               </w:rPr>
-              <w:t>模型配置</w:t>
+              <w:t>配置</w:t>
             </w:r>
           </w:p>
         </w:tc>
         <w:tc>
           <w:tcPr>
-            <w:tcW w:type="dxa" w:w="1881"/>
+            <w:tcW w:type="dxa" w:w="2436"/>
           </w:tcPr>
           <w:p>
             <w:pPr>
@@ -579,13 +330,13 @@
                 <w:b/>
                 <w:sz w:val="18"/>
               </w:rPr>
-              <w:t>AP（COCO）</w:t>
+              <w:t>AP</w:t>
             </w:r>
           </w:p>
         </w:tc>
         <w:tc>
           <w:tcPr>
-            <w:tcW w:type="dxa" w:w="1881"/>
+            <w:tcW w:type="dxa" w:w="2436"/>
           </w:tcPr>
           <w:p>
             <w:pPr>
@@ -597,13 +348,13 @@
                 <w:b/>
                 <w:sz w:val="18"/>
               </w:rPr>
-              <w:t>单 Epoch 训练时长</w:t>
+              <w:t>Epoch 时长</w:t>
             </w:r>
           </w:p>
         </w:tc>
         <w:tc>
           <w:tcPr>
-            <w:tcW w:type="dxa" w:w="1881"/>
+            <w:tcW w:type="dxa" w:w="2436"/>
           </w:tcPr>
           <w:p>
             <w:pPr>
@@ -615,25 +366,7 @@
                 <w:b/>
                 <w:sz w:val="18"/>
               </w:rPr>
-              <w:t>最大显存（MB）</w:t>
-            </w:r>
-          </w:p>
-        </w:tc>
-        <w:tc>
-          <w:tcPr>
-            <w:tcW w:type="dxa" w:w="1881"/>
-          </w:tcPr>
-          <w:p>
-            <w:pPr>
-              <w:jc w:val="center"/>
-            </w:pPr>
-            <w:r>
-              <w:rPr>
-                <w:rFonts w:ascii="宋体" w:hAnsi="宋体" w:eastAsia="宋体"/>
-                <w:b/>
-                <w:sz w:val="18"/>
-              </w:rPr>
-              <w:t>备注</w:t>
+              <w:t>显存 (MB)</w:t>
             </w:r>
           </w:p>
         </w:tc>
@@ -641,7 +374,7 @@
       <w:tr>
         <w:tc>
           <w:tcPr>
-            <w:tcW w:type="dxa" w:w="1881"/>
+            <w:tcW w:type="dxa" w:w="2436"/>
           </w:tcPr>
           <w:p>
             <w:pPr>
@@ -658,7 +391,7 @@
         </w:tc>
         <w:tc>
           <w:tcPr>
-            <w:tcW w:type="dxa" w:w="1881"/>
+            <w:tcW w:type="dxa" w:w="2436"/>
           </w:tcPr>
           <w:p>
             <w:pPr>
@@ -675,7 +408,7 @@
         </w:tc>
         <w:tc>
           <w:tcPr>
-            <w:tcW w:type="dxa" w:w="1881"/>
+            <w:tcW w:type="dxa" w:w="2436"/>
           </w:tcPr>
           <w:p>
             <w:pPr>
@@ -692,7 +425,7 @@
         </w:tc>
         <w:tc>
           <w:tcPr>
-            <w:tcW w:type="dxa" w:w="1881"/>
+            <w:tcW w:type="dxa" w:w="2436"/>
           </w:tcPr>
           <w:p>
             <w:pPr>
@@ -707,9 +440,11 @@
             </w:r>
           </w:p>
         </w:tc>
+      </w:tr>
+      <w:tr>
         <w:tc>
           <w:tcPr>
-            <w:tcW w:type="dxa" w:w="1881"/>
+            <w:tcW w:type="dxa" w:w="2436"/>
           </w:tcPr>
           <w:p>
             <w:pPr>
@@ -720,293 +455,13 @@
                 <w:rFonts w:ascii="宋体" w:hAnsi="宋体" w:eastAsia="宋体"/>
                 <w:sz w:val="18"/>
               </w:rPr>
-              <w:t>标准基准</w:t>
-            </w:r>
-          </w:p>
-        </w:tc>
-      </w:tr>
-      <w:tr>
-        <w:tc>
-          <w:tcPr>
-            <w:tcW w:type="dxa" w:w="1881"/>
-          </w:tcPr>
-          <w:p>
-            <w:pPr>
-              <w:jc w:val="center"/>
-            </w:pPr>
-            <w:r>
-              <w:rPr>
-                <w:rFonts w:ascii="宋体" w:hAnsi="宋体" w:eastAsia="宋体"/>
-                <w:sz w:val="18"/>
-              </w:rPr>
-              <w:t>q=300（最优 queries）</w:t>
+              <w:t>Stage 4（最终轻量化）</w:t>
             </w:r>
           </w:p>
         </w:tc>
         <w:tc>
           <w:tcPr>
-            <w:tcW w:type="dxa" w:w="1881"/>
-          </w:tcPr>
-          <w:p>
-            <w:pPr>
-              <w:jc w:val="center"/>
-            </w:pPr>
-            <w:r>
-              <w:rPr>
-                <w:rFonts w:ascii="宋体" w:hAnsi="宋体" w:eastAsia="宋体"/>
-                <w:sz w:val="18"/>
-              </w:rPr>
-              <w:t>0.558</w:t>
-            </w:r>
-          </w:p>
-        </w:tc>
-        <w:tc>
-          <w:tcPr>
-            <w:tcW w:type="dxa" w:w="1881"/>
-          </w:tcPr>
-          <w:p>
-            <w:pPr>
-              <w:jc w:val="center"/>
-            </w:pPr>
-            <w:r>
-              <w:rPr>
-                <w:rFonts w:ascii="宋体" w:hAnsi="宋体" w:eastAsia="宋体"/>
-                <w:sz w:val="18"/>
-              </w:rPr>
-              <w:t>0:21:44</w:t>
-            </w:r>
-          </w:p>
-        </w:tc>
-        <w:tc>
-          <w:tcPr>
-            <w:tcW w:type="dxa" w:w="1881"/>
-          </w:tcPr>
-          <w:p>
-            <w:pPr>
-              <w:jc w:val="center"/>
-            </w:pPr>
-            <w:r>
-              <w:rPr>
-                <w:rFonts w:ascii="宋体" w:hAnsi="宋体" w:eastAsia="宋体"/>
-                <w:sz w:val="18"/>
-              </w:rPr>
-              <w:t>11,560</w:t>
-            </w:r>
-          </w:p>
-        </w:tc>
-        <w:tc>
-          <w:tcPr>
-            <w:tcW w:type="dxa" w:w="1881"/>
-          </w:tcPr>
-          <w:p>
-            <w:pPr>
-              <w:jc w:val="center"/>
-            </w:pPr>
-            <w:r>
-              <w:rPr>
-                <w:rFonts w:ascii="宋体" w:hAnsi="宋体" w:eastAsia="宋体"/>
-                <w:sz w:val="18"/>
-              </w:rPr>
-              <w:t>精度最高</w:t>
-            </w:r>
-          </w:p>
-        </w:tc>
-      </w:tr>
-      <w:tr>
-        <w:tc>
-          <w:tcPr>
-            <w:tcW w:type="dxa" w:w="1881"/>
-          </w:tcPr>
-          <w:p>
-            <w:pPr>
-              <w:jc w:val="center"/>
-            </w:pPr>
-            <w:r>
-              <w:rPr>
-                <w:rFonts w:ascii="宋体" w:hAnsi="宋体" w:eastAsia="宋体"/>
-                <w:sz w:val="18"/>
-              </w:rPr>
-              <w:t>Stage 1（层剪枝）</w:t>
-            </w:r>
-          </w:p>
-        </w:tc>
-        <w:tc>
-          <w:tcPr>
-            <w:tcW w:type="dxa" w:w="1881"/>
-          </w:tcPr>
-          <w:p>
-            <w:pPr>
-              <w:jc w:val="center"/>
-            </w:pPr>
-            <w:r>
-              <w:rPr>
-                <w:rFonts w:ascii="宋体" w:hAnsi="宋体" w:eastAsia="宋体"/>
-                <w:sz w:val="18"/>
-              </w:rPr>
-              <w:t>0.533</w:t>
-            </w:r>
-          </w:p>
-        </w:tc>
-        <w:tc>
-          <w:tcPr>
-            <w:tcW w:type="dxa" w:w="1881"/>
-          </w:tcPr>
-          <w:p>
-            <w:pPr>
-              <w:jc w:val="center"/>
-            </w:pPr>
-            <w:r>
-              <w:rPr>
-                <w:rFonts w:ascii="宋体" w:hAnsi="宋体" w:eastAsia="宋体"/>
-                <w:sz w:val="18"/>
-              </w:rPr>
-              <w:t>0:15:59</w:t>
-            </w:r>
-          </w:p>
-        </w:tc>
-        <w:tc>
-          <w:tcPr>
-            <w:tcW w:type="dxa" w:w="1881"/>
-          </w:tcPr>
-          <w:p>
-            <w:pPr>
-              <w:jc w:val="center"/>
-            </w:pPr>
-            <w:r>
-              <w:rPr>
-                <w:rFonts w:ascii="宋体" w:hAnsi="宋体" w:eastAsia="宋体"/>
-                <w:sz w:val="18"/>
-              </w:rPr>
-              <w:t>10,742</w:t>
-            </w:r>
-          </w:p>
-        </w:tc>
-        <w:tc>
-          <w:tcPr>
-            <w:tcW w:type="dxa" w:w="1881"/>
-          </w:tcPr>
-          <w:p>
-            <w:pPr>
-              <w:jc w:val="center"/>
-            </w:pPr>
-            <w:r>
-              <w:rPr>
-                <w:rFonts w:ascii="宋体" w:hAnsi="宋体" w:eastAsia="宋体"/>
-                <w:sz w:val="18"/>
-              </w:rPr>
-              <w:t>提速约 26%，精度 −2.3%</w:t>
-            </w:r>
-          </w:p>
-        </w:tc>
-      </w:tr>
-      <w:tr>
-        <w:tc>
-          <w:tcPr>
-            <w:tcW w:type="dxa" w:w="1881"/>
-          </w:tcPr>
-          <w:p>
-            <w:pPr>
-              <w:jc w:val="center"/>
-            </w:pPr>
-            <w:r>
-              <w:rPr>
-                <w:rFonts w:ascii="宋体" w:hAnsi="宋体" w:eastAsia="宋体"/>
-                <w:sz w:val="18"/>
-              </w:rPr>
-              <w:t>Stage 3（+np2+稳定化）</w:t>
-            </w:r>
-          </w:p>
-        </w:tc>
-        <w:tc>
-          <w:tcPr>
-            <w:tcW w:type="dxa" w:w="1881"/>
-          </w:tcPr>
-          <w:p>
-            <w:pPr>
-              <w:jc w:val="center"/>
-            </w:pPr>
-            <w:r>
-              <w:rPr>
-                <w:rFonts w:ascii="宋体" w:hAnsi="宋体" w:eastAsia="宋体"/>
-                <w:sz w:val="18"/>
-              </w:rPr>
-              <w:t>0.511</w:t>
-            </w:r>
-          </w:p>
-        </w:tc>
-        <w:tc>
-          <w:tcPr>
-            <w:tcW w:type="dxa" w:w="1881"/>
-          </w:tcPr>
-          <w:p>
-            <w:pPr>
-              <w:jc w:val="center"/>
-            </w:pPr>
-            <w:r>
-              <w:rPr>
-                <w:rFonts w:ascii="宋体" w:hAnsi="宋体" w:eastAsia="宋体"/>
-                <w:sz w:val="18"/>
-              </w:rPr>
-              <w:t>0:15:48</w:t>
-            </w:r>
-          </w:p>
-        </w:tc>
-        <w:tc>
-          <w:tcPr>
-            <w:tcW w:type="dxa" w:w="1881"/>
-          </w:tcPr>
-          <w:p>
-            <w:pPr>
-              <w:jc w:val="center"/>
-            </w:pPr>
-            <w:r>
-              <w:rPr>
-                <w:rFonts w:ascii="宋体" w:hAnsi="宋体" w:eastAsia="宋体"/>
-                <w:sz w:val="18"/>
-              </w:rPr>
-              <w:t>10,730</w:t>
-            </w:r>
-          </w:p>
-        </w:tc>
-        <w:tc>
-          <w:tcPr>
-            <w:tcW w:type="dxa" w:w="1881"/>
-          </w:tcPr>
-          <w:p>
-            <w:pPr>
-              <w:jc w:val="center"/>
-            </w:pPr>
-            <w:r>
-              <w:rPr>
-                <w:rFonts w:ascii="宋体" w:hAnsi="宋体" w:eastAsia="宋体"/>
-                <w:sz w:val="18"/>
-              </w:rPr>
-              <w:t>量化友好配置</w:t>
-            </w:r>
-          </w:p>
-        </w:tc>
-      </w:tr>
-      <w:tr>
-        <w:tc>
-          <w:tcPr>
-            <w:tcW w:type="dxa" w:w="1881"/>
-          </w:tcPr>
-          <w:p>
-            <w:pPr>
-              <w:jc w:val="center"/>
-            </w:pPr>
-            <w:r>
-              <w:rPr>
-                <w:rFonts w:ascii="宋体" w:hAnsi="宋体" w:eastAsia="宋体"/>
-                <w:sz w:val="18"/>
-              </w:rPr>
-              <w:t>Stage 4（+DistilBERT）</w:t>
-            </w:r>
-          </w:p>
-        </w:tc>
-        <w:tc>
-          <w:tcPr>
-            <w:tcW w:type="dxa" w:w="1881"/>
+            <w:tcW w:type="dxa" w:w="2436"/>
           </w:tcPr>
           <w:p>
             <w:pPr>
@@ -1023,7 +478,7 @@
         </w:tc>
         <w:tc>
           <w:tcPr>
-            <w:tcW w:type="dxa" w:w="1881"/>
+            <w:tcW w:type="dxa" w:w="2436"/>
           </w:tcPr>
           <w:p>
             <w:pPr>
@@ -1040,7 +495,7 @@
         </w:tc>
         <w:tc>
           <w:tcPr>
-            <w:tcW w:type="dxa" w:w="1881"/>
+            <w:tcW w:type="dxa" w:w="2436"/>
           </w:tcPr>
           <w:p>
             <w:pPr>
@@ -1055,51 +510,12 @@
             </w:r>
           </w:p>
         </w:tc>
-        <w:tc>
-          <w:tcPr>
-            <w:tcW w:type="dxa" w:w="1881"/>
-          </w:tcPr>
-          <w:p>
-            <w:pPr>
-              <w:jc w:val="center"/>
-            </w:pPr>
-            <w:r>
-              <w:rPr>
-                <w:rFonts w:ascii="宋体" w:hAnsi="宋体" w:eastAsia="宋体"/>
-                <w:sz w:val="18"/>
-              </w:rPr>
-              <w:t>提速约 31%，显存 &lt;10 GB</w:t>
-            </w:r>
-          </w:p>
-        </w:tc>
       </w:tr>
     </w:tbl>
     <w:p/>
     <w:p>
       <w:pPr>
-        <w:pStyle w:val="ListBullet"/>
         <w:spacing w:before="40" w:after="40"/>
-        <w:ind w:left="283" w:hanging="227"/>
-      </w:pPr>
-      <w:r>
-        <w:rPr>
-          <w:rFonts w:ascii="宋体" w:hAnsi="宋体" w:eastAsia="宋体"/>
-          <w:b/>
-          <w:sz w:val="21"/>
-        </w:rPr>
-        <w:t>📌 关键结论：</w:t>
-      </w:r>
-      <w:r>
-        <w:rPr>
-          <w:rFonts w:ascii="宋体" w:hAnsi="宋体" w:eastAsia="宋体"/>
-          <w:sz w:val="21"/>
-        </w:rPr>
-        <w:t>相较 Baseline，Stage 4 最终配置训练提速约 31%，最大显存降低约 20%（12.2 GB → 9.8 GB），AP 精度损失控制在 4% 以内（0.552 → 0.512），满足预定优化目标。</w:t>
-      </w:r>
-    </w:p>
-    <w:p>
-      <w:pPr>
-        <w:spacing w:before="60" w:after="60"/>
         <w:pBdr>
           <w:bottom w:val="single" w:sz="6" w:space="1" w:color="4472C4"/>
         </w:pBdr>
@@ -1107,254 +523,121 @@
     </w:p>
     <w:p>
       <w:pPr>
-        <w:spacing w:before="240" w:after="80"/>
+        <w:spacing w:before="180" w:after="60"/>
       </w:pPr>
       <w:r>
         <w:rPr>
           <w:rFonts w:ascii="黑体" w:hAnsi="黑体" w:eastAsia="黑体"/>
           <w:b/>
           <w:color w:val="1F497D"/>
-          <w:sz w:val="24"/>
-          <w:u w:val="single"/>
+          <w:sz w:val="22"/>
         </w:rPr>
-        <w:t>四、主要困难与解决方案</w:t>
+        <w:t>主要困难与解决方案</w:t>
       </w:r>
     </w:p>
     <w:p>
       <w:pPr>
-        <w:spacing w:before="120" w:after="40"/>
-      </w:pPr>
-      <w:r>
-        <w:rPr>
-          <w:rFonts w:ascii="黑体" w:hAnsi="黑体" w:eastAsia="黑体"/>
-          <w:b/>
-          <w:color w:val="1F497D"/>
-          <w:sz w:val="21"/>
-        </w:rPr>
-        <w:t>困难 1：层剪枝后预训练权重无法直接加载</w:t>
-      </w:r>
-    </w:p>
-    <w:p>
-      <w:pPr>
-        <w:pStyle w:val="ListBullet"/>
-        <w:spacing w:before="40" w:after="40"/>
-        <w:ind w:left="283" w:hanging="227"/>
+        <w:spacing w:before="50" w:after="50"/>
+        <w:ind w:left="227"/>
       </w:pPr>
       <w:r>
         <w:rPr>
           <w:rFonts w:ascii="宋体" w:hAnsi="宋体" w:eastAsia="宋体"/>
           <w:b/>
+          <w:i w:val="0"/>
+          <w:color w:val="1F497D"/>
           <w:sz w:val="21"/>
         </w:rPr>
-        <w:t>【问题】</w:t>
+        <w:t>【层剪枝权重不兼容】</w:t>
       </w:r>
       <w:r>
         <w:rPr>
           <w:rFonts w:ascii="宋体" w:hAnsi="宋体" w:eastAsia="宋体"/>
+          <w:b w:val="0"/>
+          <w:i w:val="0"/>
           <w:sz w:val="21"/>
         </w:rPr>
-        <w:t>将 Encoder/Decoder 层数从 6 层裁剪为 4/3 层后，预训练权重 shape 不匹配，直接 load_state_dict 报错。</w:t>
+        <w:t>使用 --finetune_ignore 显式跳过被裁剪层参数键，实现无冲突预训练权重加载。</w:t>
       </w:r>
     </w:p>
     <w:p>
       <w:pPr>
-        <w:pStyle w:val="ListBullet"/>
-        <w:spacing w:before="40" w:after="40"/>
-        <w:ind w:left="283" w:hanging="227"/>
+        <w:spacing w:before="50" w:after="50"/>
+        <w:ind w:left="227"/>
       </w:pPr>
       <w:r>
         <w:rPr>
           <w:rFonts w:ascii="宋体" w:hAnsi="宋体" w:eastAsia="宋体"/>
           <w:b/>
+          <w:i w:val="0"/>
+          <w:color w:val="1F497D"/>
           <w:sz w:val="21"/>
         </w:rPr>
-        <w:t>【解决方案】</w:t>
+        <w:t>【DistilBERT 接口不兼容】</w:t>
       </w:r>
       <w:r>
         <w:rPr>
           <w:rFonts w:ascii="宋体" w:hAnsi="宋体" w:eastAsia="宋体"/>
+          <w:b w:val="0"/>
+          <w:i w:val="0"/>
           <w:sz w:val="21"/>
         </w:rPr>
-        <w:t>通过分析模型权重命名规则，使用 --finetune_ignore 参数显式忽略被裁剪层的参数键，实现无冲突加载；同时保留 finetune 逻辑，确保剩余层能从预训练权重中正确初始化，大幅缩短收敛所需的 epoch 数。</w:t>
+        <w:t>设计 TextEncoderShell 统一封装层，自动屏蔽 token_type_ids、降维 3D→2D mask，实现多编码器无缝切换。</w:t>
       </w:r>
     </w:p>
     <w:p>
       <w:pPr>
-        <w:spacing w:before="120" w:after="40"/>
-      </w:pPr>
-      <w:r>
-        <w:rPr>
-          <w:rFonts w:ascii="黑体" w:hAnsi="黑体" w:eastAsia="黑体"/>
-          <w:b/>
-          <w:color w:val="1F497D"/>
-          <w:sz w:val="21"/>
-        </w:rPr>
-        <w:t>困难 2：DistilBERT 替换时的接口不兼容问题</w:t>
-      </w:r>
-    </w:p>
-    <w:p>
-      <w:pPr>
-        <w:pStyle w:val="ListBullet"/>
-        <w:spacing w:before="40" w:after="40"/>
-        <w:ind w:left="283" w:hanging="227"/>
+        <w:spacing w:before="50" w:after="50"/>
+        <w:ind w:left="227"/>
       </w:pPr>
       <w:r>
         <w:rPr>
           <w:rFonts w:ascii="宋体" w:hAnsi="宋体" w:eastAsia="宋体"/>
           <w:b/>
+          <w:i w:val="0"/>
+          <w:color w:val="1F497D"/>
           <w:sz w:val="21"/>
         </w:rPr>
-        <w:t>【问题】</w:t>
+        <w:t>【AMP 数值不稳定（NaN）】</w:t>
       </w:r>
       <w:r>
         <w:rPr>
           <w:rFonts w:ascii="宋体" w:hAnsi="宋体" w:eastAsia="宋体"/>
+          <w:b w:val="0"/>
+          <w:i w:val="0"/>
           <w:sz w:val="21"/>
         </w:rPr>
-        <w:t>DistilBERT 不支持 token_type_ids 且不接受 3D attention mask（原 BERT 接口），直接替换导致前向传播报错；此外两者隐层维度相同但输出格式存在差异。</w:t>
+        <w:t>Offset clamp(±8px) + Softmax 强制 FP32 + BBox Head FP32，三措并举消除混合精度抖动，同时为 INT8 量化奠基。</w:t>
       </w:r>
     </w:p>
     <w:p>
       <w:pPr>
-        <w:pStyle w:val="ListBullet"/>
-        <w:spacing w:before="40" w:after="40"/>
-        <w:ind w:left="283" w:hanging="227"/>
+        <w:spacing w:before="50" w:after="50"/>
+        <w:ind w:left="227"/>
       </w:pPr>
       <w:r>
         <w:rPr>
           <w:rFonts w:ascii="宋体" w:hAnsi="宋体" w:eastAsia="宋体"/>
           <w:b/>
+          <w:i w:val="0"/>
+          <w:color w:val="1F497D"/>
           <w:sz w:val="21"/>
         </w:rPr>
-        <w:t>【解决方案】</w:t>
+        <w:t>【推理瓶颈误判】</w:t>
       </w:r>
       <w:r>
         <w:rPr>
           <w:rFonts w:ascii="宋体" w:hAnsi="宋体" w:eastAsia="宋体"/>
+          <w:b w:val="0"/>
+          <w:i w:val="0"/>
           <w:sz w:val="21"/>
         </w:rPr>
-        <w:t>设计 TextEncoderShell 统一封装层，自动检测编码器类型并适配接口差异：对 DistilBERT 屏蔽 token_type_ids，将 3D mask 降维为 2D padding mask，统一输出格式，实现 BERT / DistilBERT / 其他编码器的无缝切换。</w:t>
+        <w:t>自研多层级 Profiling 系统，精确定位瓶颈为 BiAttentionBlock 内的 softmax/context bmm（随 ntxt 二次方增长），驱动后续 Token Pruning 方向。</w:t>
       </w:r>
     </w:p>
     <w:p>
       <w:pPr>
-        <w:spacing w:before="120" w:after="40"/>
-      </w:pPr>
-      <w:r>
-        <w:rPr>
-          <w:rFonts w:ascii="黑体" w:hAnsi="黑体" w:eastAsia="黑体"/>
-          <w:b/>
-          <w:color w:val="1F497D"/>
-          <w:sz w:val="21"/>
-        </w:rPr>
-        <w:t>困难 3：混合精度（AMP）下的数值不稳定</w:t>
-      </w:r>
-    </w:p>
-    <w:p>
-      <w:pPr>
-        <w:pStyle w:val="ListBullet"/>
         <w:spacing w:before="40" w:after="40"/>
-        <w:ind w:left="283" w:hanging="227"/>
-      </w:pPr>
-      <w:r>
-        <w:rPr>
-          <w:rFonts w:ascii="宋体" w:hAnsi="宋体" w:eastAsia="宋体"/>
-          <w:b/>
-          <w:sz w:val="21"/>
-        </w:rPr>
-        <w:t>【问题】</w:t>
-      </w:r>
-      <w:r>
-        <w:rPr>
-          <w:rFonts w:ascii="宋体" w:hAnsi="宋体" w:eastAsia="宋体"/>
-          <w:sz w:val="21"/>
-        </w:rPr>
-        <w:t>在 Deformable Attention 的采样 offset 计算与 Softmax 操作中，FP16 精度不足导致训练不稳定，部分实验出现 loss 抖动甚至 NaN。</w:t>
-      </w:r>
-    </w:p>
-    <w:p>
-      <w:pPr>
-        <w:pStyle w:val="ListBullet"/>
-        <w:spacing w:before="40" w:after="40"/>
-        <w:ind w:left="283" w:hanging="227"/>
-      </w:pPr>
-      <w:r>
-        <w:rPr>
-          <w:rFonts w:ascii="宋体" w:hAnsi="宋体" w:eastAsia="宋体"/>
-          <w:b/>
-          <w:sz w:val="21"/>
-        </w:rPr>
-        <w:t>【解决方案】</w:t>
-      </w:r>
-      <w:r>
-        <w:rPr>
-          <w:rFonts w:ascii="宋体" w:hAnsi="宋体" w:eastAsia="宋体"/>
-          <w:sz w:val="21"/>
-        </w:rPr>
-        <w:t>针对性引入三项稳定化措施：① 对 sampling offset 做 clamp（±8 像素），抑制异常偏移；② 将 Softmax 操作强制升级为 FP32 计算；③ BBox Head 全程保持 FP32。三项措施组合后训练稳定性显著提升，为后续 INT8 量化提供了数值鲁棒的基础配置。</w:t>
-      </w:r>
-    </w:p>
-    <w:p>
-      <w:pPr>
-        <w:spacing w:before="120" w:after="40"/>
-      </w:pPr>
-      <w:r>
-        <w:rPr>
-          <w:rFonts w:ascii="黑体" w:hAnsi="黑体" w:eastAsia="黑体"/>
-          <w:b/>
-          <w:color w:val="1F497D"/>
-          <w:sz w:val="21"/>
-        </w:rPr>
-        <w:t>困难 4：推理瓶颈定位不准确</w:t>
-      </w:r>
-    </w:p>
-    <w:p>
-      <w:pPr>
-        <w:pStyle w:val="ListBullet"/>
-        <w:spacing w:before="40" w:after="40"/>
-        <w:ind w:left="283" w:hanging="227"/>
-      </w:pPr>
-      <w:r>
-        <w:rPr>
-          <w:rFonts w:ascii="宋体" w:hAnsi="宋体" w:eastAsia="宋体"/>
-          <w:b/>
-          <w:sz w:val="21"/>
-        </w:rPr>
-        <w:t>【问题】</w:t>
-      </w:r>
-      <w:r>
-        <w:rPr>
-          <w:rFonts w:ascii="宋体" w:hAnsi="宋体" w:eastAsia="宋体"/>
-          <w:sz w:val="21"/>
-        </w:rPr>
-        <w:t>初期假设减少 Query 数量或量化文本编码器可显著降低端到端延迟，但实验表明减少 Queries（900→50）对推理速度几乎无影响，量化文本塔收益也极为有限。</w:t>
-      </w:r>
-    </w:p>
-    <w:p>
-      <w:pPr>
-        <w:pStyle w:val="ListBullet"/>
-        <w:spacing w:before="40" w:after="40"/>
-        <w:ind w:left="283" w:hanging="227"/>
-      </w:pPr>
-      <w:r>
-        <w:rPr>
-          <w:rFonts w:ascii="宋体" w:hAnsi="宋体" w:eastAsia="宋体"/>
-          <w:b/>
-          <w:sz w:val="21"/>
-        </w:rPr>
-        <w:t>【解决方案】</w:t>
-      </w:r>
-      <w:r>
-        <w:rPr>
-          <w:rFonts w:ascii="宋体" w:hAnsi="宋体" w:eastAsia="宋体"/>
-          <w:sz w:val="21"/>
-        </w:rPr>
-        <w:t>设计多层级细粒度 Profiling 系统，逐级测量 tokenize、text_enc、backbone、encoder（enc_fusion / enc_msdef）、decoder 各模块耗时，结合 caption 长度变量最终定位瓶颈为 BiAttentionBlock 中的 softmax 与 context bmm（与文本 token 数呈二次方关系），为后续 Token Pruning 与 Flash Attention 改造提供了精准的优化方向。</w:t>
-      </w:r>
-    </w:p>
-    <w:p>
-      <w:pPr>
-        <w:spacing w:before="60" w:after="60"/>
         <w:pBdr>
           <w:bottom w:val="single" w:sz="6" w:space="1" w:color="4472C4"/>
         </w:pBdr>
@@ -1362,132 +645,146 @@
     </w:p>
     <w:p>
       <w:pPr>
-        <w:spacing w:before="240" w:after="80"/>
+        <w:spacing w:before="180" w:after="60"/>
       </w:pPr>
       <w:r>
         <w:rPr>
           <w:rFonts w:ascii="黑体" w:hAnsi="黑体" w:eastAsia="黑体"/>
           <w:b/>
           <w:color w:val="1F497D"/>
-          <w:sz w:val="24"/>
-          <w:u w:val="single"/>
+          <w:sz w:val="22"/>
         </w:rPr>
-        <w:t>五、核心价值与个人贡献</w:t>
+        <w:t>核心价值</w:t>
       </w:r>
     </w:p>
     <w:p>
       <w:pPr>
-        <w:spacing w:before="80" w:after="40"/>
-        <w:ind w:left="283"/>
+        <w:spacing w:before="50" w:after="50"/>
+        <w:ind w:left="227"/>
       </w:pPr>
       <w:r>
         <w:rPr>
           <w:rFonts w:ascii="宋体" w:hAnsi="宋体" w:eastAsia="宋体"/>
           <w:b/>
+          <w:i w:val="0"/>
           <w:color w:val="1F497D"/>
           <w:sz w:val="21"/>
         </w:rPr>
-        <w:t>【系统性研究能力】</w:t>
+        <w:t>◆ 系统化研究能力：</w:t>
       </w:r>
       <w:r>
         <w:rPr>
           <w:rFonts w:ascii="宋体" w:hAnsi="宋体" w:eastAsia="宋体"/>
+          <w:b w:val="0"/>
+          <w:i w:val="0"/>
           <w:sz w:val="21"/>
         </w:rPr>
-        <w:t>独立完成从环境搭建、数据预处理、分布式训练到模型评估的全流程复现，并在此基础上设计多阶段渐进式消融实验体系，展现了对大型深度学习项目的系统化研究能力。</w:t>
+        <w:t>独立完成环境搭建→数据转换→分布式训练→评估的完整深度学习项目全流程。</w:t>
       </w:r>
     </w:p>
     <w:p>
       <w:pPr>
-        <w:spacing w:before="80" w:after="40"/>
-        <w:ind w:left="283"/>
+        <w:spacing w:before="50" w:after="50"/>
+        <w:ind w:left="227"/>
       </w:pPr>
       <w:r>
         <w:rPr>
           <w:rFonts w:ascii="宋体" w:hAnsi="宋体" w:eastAsia="宋体"/>
           <w:b/>
+          <w:i w:val="0"/>
           <w:color w:val="1F497D"/>
           <w:sz w:val="21"/>
         </w:rPr>
-        <w:t>【精准的性能瓶颈分析】</w:t>
+        <w:t>◆ 数据驱动分析：</w:t>
       </w:r>
       <w:r>
         <w:rPr>
           <w:rFonts w:ascii="宋体" w:hAnsi="宋体" w:eastAsia="宋体"/>
+          <w:b w:val="0"/>
+          <w:i w:val="0"/>
           <w:sz w:val="21"/>
         </w:rPr>
-        <w:t>通过自研的多层级细粒度 Profiling 工具，将"模型很慢"这一模糊描述转化为可量化的具体数据（enc_fusion 占 encoder 增量 ~98%，softmax 与 context bmm 呈二次方增长），体现了数据驱动的工程分析思维。</w:t>
+        <w:t>自研 Profiling 工具将模糊瓶颈转化为可量化数据，驱动精准优化决策。</w:t>
       </w:r>
     </w:p>
     <w:p>
       <w:pPr>
-        <w:spacing w:before="80" w:after="40"/>
-        <w:ind w:left="283"/>
+        <w:spacing w:before="50" w:after="50"/>
+        <w:ind w:left="227"/>
       </w:pPr>
       <w:r>
         <w:rPr>
           <w:rFonts w:ascii="宋体" w:hAnsi="宋体" w:eastAsia="宋体"/>
           <w:b/>
+          <w:i w:val="0"/>
           <w:color w:val="1F497D"/>
           <w:sz w:val="21"/>
         </w:rPr>
-        <w:t>【工程实现与问题解决】</w:t>
+        <w:t>◆ 工程实现能力：</w:t>
       </w:r>
       <w:r>
         <w:rPr>
           <w:rFonts w:ascii="宋体" w:hAnsi="宋体" w:eastAsia="宋体"/>
+          <w:b w:val="0"/>
+          <w:i w:val="0"/>
           <w:sz w:val="21"/>
         </w:rPr>
-        <w:t>在实际工程落地中独立解决了权重加载不兼容、编码器接口适配、AMP 数值不稳定等多个较复杂的工程问题，展现了扎实的 PyTorch 底层代码能力与调试能力。</w:t>
+        <w:t>独立解决权重加载、编码器接口适配、AMP 稳定化等复杂工程问题，具备扎实 PyTorch 底层能力。</w:t>
       </w:r>
     </w:p>
     <w:p>
       <w:pPr>
-        <w:spacing w:before="80" w:after="40"/>
-        <w:ind w:left="283"/>
+        <w:spacing w:before="50" w:after="50"/>
+        <w:ind w:left="227"/>
       </w:pPr>
       <w:r>
         <w:rPr>
           <w:rFonts w:ascii="宋体" w:hAnsi="宋体" w:eastAsia="宋体"/>
           <w:b/>
+          <w:i w:val="0"/>
           <w:color w:val="1F497D"/>
           <w:sz w:val="21"/>
         </w:rPr>
-        <w:t>【面向部署的优化意识】</w:t>
+        <w:t>◆ 部署优化意识：</w:t>
       </w:r>
       <w:r>
         <w:rPr>
           <w:rFonts w:ascii="宋体" w:hAnsi="宋体" w:eastAsia="宋体"/>
+          <w:b w:val="0"/>
+          <w:i w:val="0"/>
           <w:sz w:val="21"/>
         </w:rPr>
-        <w:t>所有优化决策均以"精度可控、部署友好、量化鲁棒"为目标，Stage 3 的数值稳定化配置专为 INT8 量化铺路，体现了从学术研究迈向工业部署的系统化思考。</w:t>
+        <w:t>所有优化以"精度可控·量化鲁棒·显存友好"为准则，面向工业级推理部署。</w:t>
       </w:r>
     </w:p>
     <w:p>
       <w:pPr>
-        <w:spacing w:before="80" w:after="40"/>
-        <w:ind w:left="283"/>
+        <w:spacing w:before="50" w:after="50"/>
+        <w:ind w:left="227"/>
       </w:pPr>
       <w:r>
         <w:rPr>
           <w:rFonts w:ascii="宋体" w:hAnsi="宋体" w:eastAsia="宋体"/>
           <w:b/>
+          <w:i w:val="0"/>
           <w:color w:val="1F497D"/>
           <w:sz w:val="21"/>
         </w:rPr>
-        <w:t>【深度学习理论与实践结合】</w:t>
+        <w:t>◆ 理论与实践结合：</w:t>
       </w:r>
       <w:r>
         <w:rPr>
           <w:rFonts w:ascii="宋体" w:hAnsi="宋体" w:eastAsia="宋体"/>
+          <w:b w:val="0"/>
+          <w:i w:val="0"/>
           <w:sz w:val="21"/>
         </w:rPr>
-        <w:t>将 DETR/Deformable-DETR 的 Query 机制、BERT 文本编码器的微调策略、Transformer 注意力复杂度分析等理论知识与具体的实验结果相互印证，形成了理论指导实践、实践反哺理论的良性研究循环。</w:t>
+        <w:t>将 DETR Query 机制、Attention 复杂度理论与实验数据相互印证，形成完整研究闭环。</w:t>
       </w:r>
     </w:p>
     <w:p>
       <w:pPr>
-        <w:spacing w:before="60" w:after="60"/>
+        <w:spacing w:before="40" w:after="40"/>
         <w:pBdr>
           <w:bottom w:val="single" w:sz="6" w:space="1" w:color="4472C4"/>
         </w:pBdr>
@@ -1496,20 +793,22 @@
     <w:p>
       <w:pPr>
         <w:jc w:val="center"/>
-        <w:spacing w:before="120" w:after="0"/>
+        <w:spacing w:before="80" w:after="0"/>
       </w:pPr>
       <w:r>
         <w:rPr>
           <w:rFonts w:ascii="宋体" w:hAnsi="宋体" w:eastAsia="宋体"/>
+          <w:b w:val="0"/>
+          <w:i w:val="0"/>
           <w:color w:val="595959"/>
           <w:sz w:val="18"/>
         </w:rPr>
-        <w:t>本项目代码已开源，详见：https://github.com/MengQxuan/Open-GroundingDino</w:t>
+        <w:t>代码开源：https://github.com/MengQxuan/Open-GroundingDino</w:t>
       </w:r>
     </w:p>
     <w:sectPr>
       <w:pgSz w:w="12240" w:h="15840"/>
-      <w:pgMar w:top="1134" w:right="1417" w:bottom="1134" w:left="1417" w:header="720" w:footer="720" w:gutter="0"/>
+      <w:pgMar w:top="1020" w:right="1247" w:bottom="1020" w:left="1247" w:header="720" w:footer="720" w:gutter="0"/>
       <w:cols w:space="720"/>
       <w:docGrid w:linePitch="360"/>
     </w:sectPr>

</xml_diff>

<commit_message>
Merge 核心价值 bullets into a single flowing Chinese paragraph
Co-authored-by: MengQxuan <132590327+MengQxuan@users.noreply.github.com>
</commit_message>
<xml_diff>
--- a/resume_project.docx
+++ b/resume_project.docx
@@ -659,127 +659,15 @@
     </w:p>
     <w:p>
       <w:pPr>
-        <w:spacing w:before="50" w:after="50"/>
+        <w:spacing w:before="60" w:after="80"/>
         <w:ind w:left="227"/>
       </w:pPr>
       <w:r>
         <w:rPr>
           <w:rFonts w:ascii="宋体" w:hAnsi="宋体" w:eastAsia="宋体"/>
-          <w:b/>
-          <w:i w:val="0"/>
-          <w:color w:val="1F497D"/>
           <w:sz w:val="21"/>
         </w:rPr>
-        <w:t>◆ 系统化研究能力：</w:t>
-      </w:r>
-      <w:r>
-        <w:rPr>
-          <w:rFonts w:ascii="宋体" w:hAnsi="宋体" w:eastAsia="宋体"/>
-          <w:b w:val="0"/>
-          <w:i w:val="0"/>
-          <w:sz w:val="21"/>
-        </w:rPr>
-        <w:t>独立完成环境搭建→数据转换→分布式训练→评估的完整深度学习项目全流程。</w:t>
-      </w:r>
-    </w:p>
-    <w:p>
-      <w:pPr>
-        <w:spacing w:before="50" w:after="50"/>
-        <w:ind w:left="227"/>
-      </w:pPr>
-      <w:r>
-        <w:rPr>
-          <w:rFonts w:ascii="宋体" w:hAnsi="宋体" w:eastAsia="宋体"/>
-          <w:b/>
-          <w:i w:val="0"/>
-          <w:color w:val="1F497D"/>
-          <w:sz w:val="21"/>
-        </w:rPr>
-        <w:t>◆ 数据驱动分析：</w:t>
-      </w:r>
-      <w:r>
-        <w:rPr>
-          <w:rFonts w:ascii="宋体" w:hAnsi="宋体" w:eastAsia="宋体"/>
-          <w:b w:val="0"/>
-          <w:i w:val="0"/>
-          <w:sz w:val="21"/>
-        </w:rPr>
-        <w:t>自研 Profiling 工具将模糊瓶颈转化为可量化数据，驱动精准优化决策。</w:t>
-      </w:r>
-    </w:p>
-    <w:p>
-      <w:pPr>
-        <w:spacing w:before="50" w:after="50"/>
-        <w:ind w:left="227"/>
-      </w:pPr>
-      <w:r>
-        <w:rPr>
-          <w:rFonts w:ascii="宋体" w:hAnsi="宋体" w:eastAsia="宋体"/>
-          <w:b/>
-          <w:i w:val="0"/>
-          <w:color w:val="1F497D"/>
-          <w:sz w:val="21"/>
-        </w:rPr>
-        <w:t>◆ 工程实现能力：</w:t>
-      </w:r>
-      <w:r>
-        <w:rPr>
-          <w:rFonts w:ascii="宋体" w:hAnsi="宋体" w:eastAsia="宋体"/>
-          <w:b w:val="0"/>
-          <w:i w:val="0"/>
-          <w:sz w:val="21"/>
-        </w:rPr>
-        <w:t>独立解决权重加载、编码器接口适配、AMP 稳定化等复杂工程问题，具备扎实 PyTorch 底层能力。</w:t>
-      </w:r>
-    </w:p>
-    <w:p>
-      <w:pPr>
-        <w:spacing w:before="50" w:after="50"/>
-        <w:ind w:left="227"/>
-      </w:pPr>
-      <w:r>
-        <w:rPr>
-          <w:rFonts w:ascii="宋体" w:hAnsi="宋体" w:eastAsia="宋体"/>
-          <w:b/>
-          <w:i w:val="0"/>
-          <w:color w:val="1F497D"/>
-          <w:sz w:val="21"/>
-        </w:rPr>
-        <w:t>◆ 部署优化意识：</w:t>
-      </w:r>
-      <w:r>
-        <w:rPr>
-          <w:rFonts w:ascii="宋体" w:hAnsi="宋体" w:eastAsia="宋体"/>
-          <w:b w:val="0"/>
-          <w:i w:val="0"/>
-          <w:sz w:val="21"/>
-        </w:rPr>
-        <w:t>所有优化以"精度可控·量化鲁棒·显存友好"为准则，面向工业级推理部署。</w:t>
-      </w:r>
-    </w:p>
-    <w:p>
-      <w:pPr>
-        <w:spacing w:before="50" w:after="50"/>
-        <w:ind w:left="227"/>
-      </w:pPr>
-      <w:r>
-        <w:rPr>
-          <w:rFonts w:ascii="宋体" w:hAnsi="宋体" w:eastAsia="宋体"/>
-          <w:b/>
-          <w:i w:val="0"/>
-          <w:color w:val="1F497D"/>
-          <w:sz w:val="21"/>
-        </w:rPr>
-        <w:t>◆ 理论与实践结合：</w:t>
-      </w:r>
-      <w:r>
-        <w:rPr>
-          <w:rFonts w:ascii="宋体" w:hAnsi="宋体" w:eastAsia="宋体"/>
-          <w:b w:val="0"/>
-          <w:i w:val="0"/>
-          <w:sz w:val="21"/>
-        </w:rPr>
-        <w:t>将 DETR Query 机制、Attention 复杂度理论与实验数据相互印证，形成完整研究闭环。</w:t>
+        <w:t>本人具备独立完成深度学习项目全流程的系统化研究能力，能够从环境搭建、数据预处理到分布式训练与模型评估一手推进；善于借助自研的细粒度 Profiling 工具将模糊的性能问题转化为可量化数据，以数据驱动方式做出精准优化决策；在工程落地中独立解决了预训练权重加载冲突、多编码器接口适配、AMP 混合精度数值不稳定等复杂问题，具备扎实的 PyTorch 底层实现能力；所有优化方案均以"精度可控、量化鲁棒、显存友好"为准则，始终面向工业级推理部署；能够将 DETR Query 机制、Transformer 注意力复杂度等理论知识与实验结果相互印证，形成理论指导实践、实践反哺理论的完整研究闭环。</w:t>
       </w:r>
     </w:p>
     <w:p>

</xml_diff>

<commit_message>
Simplify and tighten 4 resume sections (项目背景/主要工作/性能提升/主要困难)
Co-authored-by: MengQxuan <132590327+MengQxuan@users.noreply.github.com>
</commit_message>
<xml_diff>
--- a/resume_project.docx
+++ b/resume_project.docx
@@ -63,11 +63,9 @@
       <w:r>
         <w:rPr>
           <w:rFonts w:ascii="宋体" w:hAnsi="宋体" w:eastAsia="宋体"/>
-          <w:b w:val="0"/>
-          <w:i w:val="0"/>
           <w:sz w:val="21"/>
         </w:rPr>
-        <w:t>GroundingDINO 将视觉 Transformer 与 BERT 深度融合，实现任意自然语言驱动的目标检测，但其推理开销大、Object Queries 冗余严重、跨模态融合模块（BiAttentionBlock）延迟随 Caption 长度呈二次方增长。本项目以 Open-GroundingDINO 为基础，在精度损失 ≤5% 的目标下，系统开展结构剪枝与推理加速研究，将显存从 ~12 GB 降至 10 GB 以内。</w:t>
+        <w:t>GroundingDINO 以视觉-语言跨模态融合实现开放词汇检测，但存在 Object Queries 严重冗余、跨模态融合模块（BiAttentionBlock）延迟随文本长度二次方增长等部署瓶颈。本项目基于 Open-GroundingDINO，系统开展结构剪枝与推理加速，目标精度损失 ≤5%、显存从 12 GB 降至 10 GB 以内。</w:t>
       </w:r>
     </w:p>
     <w:p>
@@ -100,21 +98,9 @@
       <w:r>
         <w:rPr>
           <w:rFonts w:ascii="宋体" w:hAnsi="宋体" w:eastAsia="宋体"/>
-          <w:b/>
-          <w:i w:val="0"/>
-          <w:color w:val="1F497D"/>
           <w:sz w:val="21"/>
         </w:rPr>
-        <w:t>▸ 复现与基准建立：</w:t>
-      </w:r>
-      <w:r>
-        <w:rPr>
-          <w:rFonts w:ascii="宋体" w:hAnsi="宋体" w:eastAsia="宋体"/>
-          <w:b w:val="0"/>
-          <w:i w:val="0"/>
-          <w:sz w:val="21"/>
-        </w:rPr>
-        <w:t>完成 COCO 2017 ODVG 格式转换与 DDP 分布式训练全流程，建立 Baseline（AP=0.552），种子固定后波动 ≤0.002。</w:t>
+        <w:t>▸ 复现与基准建立：完成 COCO 2017 ODVG 转换 + 双卡 DDP 训练全流程，Baseline AP = 0.552，实验波动 ≤ 0.002。</w:t>
       </w:r>
     </w:p>
     <w:p>
@@ -125,21 +111,9 @@
       <w:r>
         <w:rPr>
           <w:rFonts w:ascii="宋体" w:hAnsi="宋体" w:eastAsia="宋体"/>
-          <w:b/>
-          <w:i w:val="0"/>
-          <w:color w:val="1F497D"/>
           <w:sz w:val="21"/>
         </w:rPr>
-        <w:t>▸ Queries 冗余分析：</w:t>
-      </w:r>
-      <w:r>
-        <w:rPr>
-          <w:rFonts w:ascii="宋体" w:hAnsi="宋体" w:eastAsia="宋体"/>
-          <w:b w:val="0"/>
-          <w:i w:val="0"/>
-          <w:sz w:val="21"/>
-        </w:rPr>
-        <w:t>num_queries 900→200 精度几乎不变（ΔAP&lt;0.003）；Top-K Pruning 无效；Profiling 定位真正瓶颈为 enc_fusion（BiAttentionBlock，占 Encoder 增量 ~98%）。</w:t>
+        <w:t>▸ Queries 冗余分析：num_queries 900→200 精度不变（ΔAP&lt;0.003）；Top-K Pruning 无效；Profiling 定位瓶颈为 enc_fusion（BiAttentionBlock，占增量 98%）。</w:t>
       </w:r>
     </w:p>
     <w:p>
@@ -150,21 +124,9 @@
       <w:r>
         <w:rPr>
           <w:rFonts w:ascii="宋体" w:hAnsi="宋体" w:eastAsia="宋体"/>
-          <w:b/>
-          <w:i w:val="0"/>
-          <w:color w:val="1F497D"/>
           <w:sz w:val="21"/>
         </w:rPr>
-        <w:t>▸ 多阶段轻量化：</w:t>
-      </w:r>
-      <w:r>
-        <w:rPr>
-          <w:rFonts w:ascii="宋体" w:hAnsi="宋体" w:eastAsia="宋体"/>
-          <w:b w:val="0"/>
-          <w:i w:val="0"/>
-          <w:sz w:val="21"/>
-        </w:rPr>
-        <w:t>Stage1 层剪枝（Enc 6→4, Dec 6→3）；Stage2 降采样（dec_n_points 4→2）；Stage3 AMP 数值稳定化（offset clamp + FP32 softmax）；Stage4 BERT→DistilBERT 替换。</w:t>
+        <w:t>▸ 四阶段轻量化：层剪枝（Enc 6→4, Dec 6→3）→ Cross-Attn 降采样（points 4→2）→ AMP 稳定化（offset clamp + FP32 softmax）→ DistilBERT 替换。</w:t>
       </w:r>
     </w:p>
     <w:p>
@@ -175,21 +137,9 @@
       <w:r>
         <w:rPr>
           <w:rFonts w:ascii="宋体" w:hAnsi="宋体" w:eastAsia="宋体"/>
-          <w:b/>
-          <w:i w:val="0"/>
-          <w:color w:val="1F497D"/>
           <w:sz w:val="21"/>
         </w:rPr>
-        <w:t>▸ 延迟量化分析：</w:t>
-      </w:r>
-      <w:r>
-        <w:rPr>
-          <w:rFonts w:ascii="宋体" w:hAnsi="宋体" w:eastAsia="宋体"/>
-          <w:b w:val="0"/>
-          <w:i w:val="0"/>
-          <w:sz w:val="21"/>
-        </w:rPr>
-        <w:t>Caption 长度对文本编码器延迟无影响（~4ms 恒定）；&gt;97% 增量来自 enc_fusion 中的 softmax/context bmm，建立二次方增长模型，为 Token Pruning / Flash Attention 指明优化路径。</w:t>
+        <w:t>▸ 延迟分析：文本编码器延迟恒定 ~4 ms；&gt;97% 延迟增量来自 enc_fusion（softmax/bmm 随文本长度二次方增长），指明 Token Pruning / Flash Attention 优化方向。</w:t>
       </w:r>
     </w:p>
     <w:p>
@@ -221,68 +171,9 @@
       <w:r>
         <w:rPr>
           <w:rFonts w:ascii="宋体" w:hAnsi="宋体" w:eastAsia="宋体"/>
-          <w:b w:val="0"/>
-          <w:i w:val="0"/>
           <w:sz w:val="21"/>
         </w:rPr>
-        <w:t xml:space="preserve">Stage 4 最终配置（层剪枝 + 降采样 + 稳定化 + DistilBERT）较 Baseline：训练提速 </w:t>
-      </w:r>
-      <w:r>
-        <w:rPr>
-          <w:rFonts w:ascii="宋体" w:hAnsi="宋体" w:eastAsia="宋体"/>
-          <w:b/>
-          <w:i w:val="0"/>
-          <w:color w:val="1F497D"/>
-          <w:sz w:val="21"/>
-        </w:rPr>
-        <w:t>约 31%</w:t>
-      </w:r>
-      <w:r>
-        <w:rPr>
-          <w:rFonts w:ascii="宋体" w:hAnsi="宋体" w:eastAsia="宋体"/>
-          <w:b w:val="0"/>
-          <w:i w:val="0"/>
-          <w:sz w:val="21"/>
-        </w:rPr>
-        <w:t xml:space="preserve">，显存降低 </w:t>
-      </w:r>
-      <w:r>
-        <w:rPr>
-          <w:rFonts w:ascii="宋体" w:hAnsi="宋体" w:eastAsia="宋体"/>
-          <w:b/>
-          <w:i w:val="0"/>
-          <w:color w:val="1F497D"/>
-          <w:sz w:val="21"/>
-        </w:rPr>
-        <w:t>约 20%</w:t>
-      </w:r>
-      <w:r>
-        <w:rPr>
-          <w:rFonts w:ascii="宋体" w:hAnsi="宋体" w:eastAsia="宋体"/>
-          <w:b w:val="0"/>
-          <w:i w:val="0"/>
-          <w:sz w:val="21"/>
-        </w:rPr>
-        <w:t xml:space="preserve">（12.2 GB → 9.8 GB），AP 精度损失 </w:t>
-      </w:r>
-      <w:r>
-        <w:rPr>
-          <w:rFonts w:ascii="宋体" w:hAnsi="宋体" w:eastAsia="宋体"/>
-          <w:b/>
-          <w:i w:val="0"/>
-          <w:color w:val="1F497D"/>
-          <w:sz w:val="21"/>
-        </w:rPr>
-        <w:t>&lt;4%</w:t>
-      </w:r>
-      <w:r>
-        <w:rPr>
-          <w:rFonts w:ascii="宋体" w:hAnsi="宋体" w:eastAsia="宋体"/>
-          <w:b w:val="0"/>
-          <w:i w:val="0"/>
-          <w:sz w:val="21"/>
-        </w:rPr>
-        <w:t>（0.552 → 0.512）。</w:t>
+        <w:t>四阶段轻量化配置较 Baseline：训练提速 31%（21 min→15 min），显存降低 20%（12.2 GB→9.8 GB），AP 损失 &lt;4%（0.552→0.512）。</w:t>
       </w:r>
     </w:p>
     <w:tbl>
@@ -543,21 +434,9 @@
       <w:r>
         <w:rPr>
           <w:rFonts w:ascii="宋体" w:hAnsi="宋体" w:eastAsia="宋体"/>
-          <w:b/>
-          <w:i w:val="0"/>
-          <w:color w:val="1F497D"/>
           <w:sz w:val="21"/>
         </w:rPr>
-        <w:t>【层剪枝权重不兼容】</w:t>
-      </w:r>
-      <w:r>
-        <w:rPr>
-          <w:rFonts w:ascii="宋体" w:hAnsi="宋体" w:eastAsia="宋体"/>
-          <w:b w:val="0"/>
-          <w:i w:val="0"/>
-          <w:sz w:val="21"/>
-        </w:rPr>
-        <w:t>使用 --finetune_ignore 显式跳过被裁剪层参数键，实现无冲突预训练权重加载。</w:t>
+        <w:t>【层剪枝权重不兼容】用 --finetune_ignore 跳过被裁剪层参数键，无冲突加载预训练权重。</w:t>
       </w:r>
     </w:p>
     <w:p>
@@ -568,21 +447,9 @@
       <w:r>
         <w:rPr>
           <w:rFonts w:ascii="宋体" w:hAnsi="宋体" w:eastAsia="宋体"/>
-          <w:b/>
-          <w:i w:val="0"/>
-          <w:color w:val="1F497D"/>
           <w:sz w:val="21"/>
         </w:rPr>
-        <w:t>【DistilBERT 接口不兼容】</w:t>
-      </w:r>
-      <w:r>
-        <w:rPr>
-          <w:rFonts w:ascii="宋体" w:hAnsi="宋体" w:eastAsia="宋体"/>
-          <w:b w:val="0"/>
-          <w:i w:val="0"/>
-          <w:sz w:val="21"/>
-        </w:rPr>
-        <w:t>设计 TextEncoderShell 统一封装层，自动屏蔽 token_type_ids、降维 3D→2D mask，实现多编码器无缝切换。</w:t>
+        <w:t>【DistilBERT 接口不兼容】设计 TextEncoderShell 封装层，自动屏蔽 token_type_ids、将 3D mask 降维为 2D，实现多编码器无缝切换。</w:t>
       </w:r>
     </w:p>
     <w:p>
@@ -593,21 +460,9 @@
       <w:r>
         <w:rPr>
           <w:rFonts w:ascii="宋体" w:hAnsi="宋体" w:eastAsia="宋体"/>
-          <w:b/>
-          <w:i w:val="0"/>
-          <w:color w:val="1F497D"/>
           <w:sz w:val="21"/>
         </w:rPr>
-        <w:t>【AMP 数值不稳定（NaN）】</w:t>
-      </w:r>
-      <w:r>
-        <w:rPr>
-          <w:rFonts w:ascii="宋体" w:hAnsi="宋体" w:eastAsia="宋体"/>
-          <w:b w:val="0"/>
-          <w:i w:val="0"/>
-          <w:sz w:val="21"/>
-        </w:rPr>
-        <w:t>Offset clamp(±8px) + Softmax 强制 FP32 + BBox Head FP32，三措并举消除混合精度抖动，同时为 INT8 量化奠基。</w:t>
+        <w:t>【AMP 数值不稳定（NaN）】Offset clamp ±8px + Softmax FP32 + BBox Head FP32，三项措施消除混合精度抖动，同步夯实 INT8 量化基础。</w:t>
       </w:r>
     </w:p>
     <w:p>
@@ -618,21 +473,9 @@
       <w:r>
         <w:rPr>
           <w:rFonts w:ascii="宋体" w:hAnsi="宋体" w:eastAsia="宋体"/>
-          <w:b/>
-          <w:i w:val="0"/>
-          <w:color w:val="1F497D"/>
           <w:sz w:val="21"/>
         </w:rPr>
-        <w:t>【推理瓶颈误判】</w:t>
-      </w:r>
-      <w:r>
-        <w:rPr>
-          <w:rFonts w:ascii="宋体" w:hAnsi="宋体" w:eastAsia="宋体"/>
-          <w:b w:val="0"/>
-          <w:i w:val="0"/>
-          <w:sz w:val="21"/>
-        </w:rPr>
-        <w:t>自研多层级 Profiling 系统，精确定位瓶颈为 BiAttentionBlock 内的 softmax/context bmm（随 ntxt 二次方增长），驱动后续 Token Pruning 方向。</w:t>
+        <w:t>【推理瓶颈误判】自研多层级 Profiling，精确定位瓶颈为 BiAttentionBlock 的 softmax/bmm（O(n²)），驱动后续 Token Pruning 优化方向。</w:t>
       </w:r>
     </w:p>
     <w:p>

</xml_diff>

<commit_message>
Add 个人简介 section to resume_project.docx
Co-authored-by: MengQxuan <132590327+MengQxuan@users.noreply.github.com>
</commit_message>
<xml_diff>
--- a/resume_project.docx
+++ b/resume_project.docx
@@ -32,6 +32,42 @@
           <w:sz w:val="20"/>
         </w:rPr>
         <w:t>2026.01 – 至今</w:t>
+      </w:r>
+    </w:p>
+    <w:p>
+      <w:pPr>
+        <w:spacing w:before="40" w:after="40"/>
+        <w:pBdr>
+          <w:bottom w:val="single" w:sz="6" w:space="1" w:color="4472C4"/>
+        </w:pBdr>
+      </w:pPr>
+    </w:p>
+    <w:p>
+      <w:pPr>
+        <w:spacing w:before="180" w:after="60"/>
+      </w:pPr>
+      <w:r>
+        <w:rPr>
+          <w:rFonts w:ascii="黑体" w:hAnsi="黑体" w:eastAsia="黑体"/>
+          <w:b/>
+          <w:color w:val="1F497D"/>
+          <w:sz w:val="22"/>
+          <w:u w:val="single"/>
+        </w:rPr>
+        <w:t>个人简介</w:t>
+      </w:r>
+    </w:p>
+    <w:p>
+      <w:pPr>
+        <w:spacing w:before="60" w:after="80"/>
+        <w:ind w:left="227"/>
+      </w:pPr>
+      <w:r>
+        <w:rPr>
+          <w:rFonts w:ascii="宋体" w:hAnsi="宋体" w:eastAsia="宋体"/>
+          <w:sz w:val="21"/>
+        </w:rPr>
+        <w:t>计算机视觉方向研究者，专注于多模态目标检测模型的结构优化与推理加速。熟悉 PyTorch 分布式训练（DDP/AMP）及 Transformer 架构（DETR、Deformable-DETR、GroundingDINO），具备从数据预处理、模型训练到性能评估的完整工程实践能力。擅长通过自研 Profiling 工具将性能瓶颈量化定位，并在层剪枝、注意力降采样、混合精度稳定化、轻量化编码器替换等方向积累了系统性经验；代码能力扎实，能够独立解决预训练权重兼容性、多编码器接口适配、量化数值稳定性等复杂工程问题，具备良好的科研素养与面向部署的工程意识。</w:t>
       </w:r>
     </w:p>
     <w:p>

</xml_diff>